<commit_message>
Ajusta maquetación de la impugnación y agrega versión PDF
Co-Authored-By: Claude Fable 5.1 <noreply@anthropic.com>
Claude-Session: https://claude.ai/code/session_01FCAyLEasNAXGTWYUMf7sAF
</commit_message>
<xml_diff>
--- a/caso-finca-el-pino-ragonvalia/IMPUGNACION_TUTELA_2026-00107_v2.docx
+++ b/caso-finca-el-pino-ragonvalia/IMPUGNACION_TUTELA_2026-00107_v2.docx
@@ -58,16 +58,17 @@
       <w:tblPr>
         <w:tblW w:type="auto" w:w="0"/>
         <w:jc w:val="left"/>
+        <w:tblLayout w:type="fixed"/>
         <w:tblLook w:firstColumn="1" w:firstRow="1" w:lastColumn="0" w:lastRow="0" w:noHBand="0" w:noVBand="1" w:val="04A0"/>
       </w:tblPr>
       <w:tblGrid>
-        <w:gridCol w:w="4561"/>
-        <w:gridCol w:w="4561"/>
+        <w:gridCol w:w="2041"/>
+        <w:gridCol w:w="7030"/>
       </w:tblGrid>
       <w:tr>
         <w:tc>
           <w:tcPr>
-            <w:tcW w:type="dxa" w:w="1984"/>
+            <w:tcW w:type="dxa" w:w="2041"/>
           </w:tcPr>
           <w:p>
             <w:pPr>
@@ -83,7 +84,7 @@
         </w:tc>
         <w:tc>
           <w:tcPr>
-            <w:tcW w:type="dxa" w:w="7087"/>
+            <w:tcW w:type="dxa" w:w="7030"/>
           </w:tcPr>
           <w:p>
             <w:pPr>
@@ -98,7 +99,7 @@
       <w:tr>
         <w:tc>
           <w:tcPr>
-            <w:tcW w:type="dxa" w:w="1984"/>
+            <w:tcW w:type="dxa" w:w="2041"/>
           </w:tcPr>
           <w:p>
             <w:pPr>
@@ -114,7 +115,7 @@
         </w:tc>
         <w:tc>
           <w:tcPr>
-            <w:tcW w:type="dxa" w:w="7087"/>
+            <w:tcW w:type="dxa" w:w="7030"/>
           </w:tcPr>
           <w:p>
             <w:pPr>
@@ -129,7 +130,7 @@
       <w:tr>
         <w:tc>
           <w:tcPr>
-            <w:tcW w:type="dxa" w:w="1984"/>
+            <w:tcW w:type="dxa" w:w="2041"/>
           </w:tcPr>
           <w:p>
             <w:pPr>
@@ -145,7 +146,7 @@
         </w:tc>
         <w:tc>
           <w:tcPr>
-            <w:tcW w:type="dxa" w:w="7087"/>
+            <w:tcW w:type="dxa" w:w="7030"/>
           </w:tcPr>
           <w:p>
             <w:pPr>
@@ -160,7 +161,7 @@
       <w:tr>
         <w:tc>
           <w:tcPr>
-            <w:tcW w:type="dxa" w:w="1984"/>
+            <w:tcW w:type="dxa" w:w="2041"/>
           </w:tcPr>
           <w:p>
             <w:pPr>
@@ -176,7 +177,7 @@
         </w:tc>
         <w:tc>
           <w:tcPr>
-            <w:tcW w:type="dxa" w:w="7087"/>
+            <w:tcW w:type="dxa" w:w="7030"/>
           </w:tcPr>
           <w:p>
             <w:pPr>
@@ -191,7 +192,7 @@
       <w:tr>
         <w:tc>
           <w:tcPr>
-            <w:tcW w:type="dxa" w:w="1984"/>
+            <w:tcW w:type="dxa" w:w="2041"/>
           </w:tcPr>
           <w:p>
             <w:pPr>
@@ -207,7 +208,7 @@
         </w:tc>
         <w:tc>
           <w:tcPr>
-            <w:tcW w:type="dxa" w:w="7087"/>
+            <w:tcW w:type="dxa" w:w="7030"/>
           </w:tcPr>
           <w:p>
             <w:pPr>
@@ -1613,6 +1614,7 @@
     </w:p>
     <w:p>
       <w:pPr>
+        <w:keepNext/>
         <w:spacing w:after="120"/>
         <w:jc w:val="both"/>
       </w:pPr>
@@ -1626,13 +1628,8 @@
     </w:p>
     <w:p>
       <w:pPr>
-        <w:spacing w:after="360"/>
-        <w:jc w:val="both"/>
-      </w:pPr>
-    </w:p>
-    <w:p>
-      <w:pPr>
-        <w:spacing w:after="720"/>
+        <w:keepNext/>
+        <w:spacing w:after="720" w:before="360"/>
         <w:jc w:val="left"/>
       </w:pPr>
       <w:r>
@@ -1645,6 +1642,7 @@
     </w:p>
     <w:p>
       <w:pPr>
+        <w:keepNext/>
         <w:spacing w:after="0"/>
         <w:jc w:val="left"/>
       </w:pPr>
@@ -1658,6 +1656,7 @@
     </w:p>
     <w:p>
       <w:pPr>
+        <w:keepNext/>
         <w:spacing w:after="0"/>
         <w:jc w:val="left"/>
       </w:pPr>
@@ -1671,6 +1670,7 @@
     </w:p>
     <w:p>
       <w:pPr>
+        <w:keepNext/>
         <w:spacing w:after="0"/>
         <w:jc w:val="left"/>
       </w:pPr>

</xml_diff>